<commit_message>
party packing & tofixed function added
</commit_message>
<xml_diff>
--- a/electron/database/generate-document/templates/party-packing.docx
+++ b/electron/database/generate-document/templates/party-packing.docx
@@ -10,10 +10,10 @@
         <w:tblLook w:val="04A0" w:firstRow="1" w:lastRow="0" w:firstColumn="1" w:lastColumn="0" w:noHBand="0" w:noVBand="1"/>
       </w:tblPr>
       <w:tblGrid>
-        <w:gridCol w:w="3201"/>
-        <w:gridCol w:w="2575"/>
-        <w:gridCol w:w="2726"/>
-        <w:gridCol w:w="2604"/>
+        <w:gridCol w:w="3444"/>
+        <w:gridCol w:w="2496"/>
+        <w:gridCol w:w="2641"/>
+        <w:gridCol w:w="2525"/>
       </w:tblGrid>
       <w:tr>
         <w:trPr>
@@ -1689,16 +1689,16 @@
               <w:tblLook w:val="04A0" w:firstRow="1" w:lastRow="0" w:firstColumn="1" w:lastColumn="0" w:noHBand="0" w:noVBand="1"/>
             </w:tblPr>
             <w:tblGrid>
-              <w:gridCol w:w="1099"/>
-              <w:gridCol w:w="1378"/>
-              <w:gridCol w:w="1298"/>
-              <w:gridCol w:w="1172"/>
-              <w:gridCol w:w="1129"/>
-              <w:gridCol w:w="1051"/>
-              <w:gridCol w:w="923"/>
-              <w:gridCol w:w="700"/>
-              <w:gridCol w:w="844"/>
-              <w:gridCol w:w="1296"/>
+              <w:gridCol w:w="949"/>
+              <w:gridCol w:w="2045"/>
+              <w:gridCol w:w="1115"/>
+              <w:gridCol w:w="1010"/>
+              <w:gridCol w:w="974"/>
+              <w:gridCol w:w="910"/>
+              <w:gridCol w:w="803"/>
+              <w:gridCol w:w="930"/>
+              <w:gridCol w:w="1041"/>
+              <w:gridCol w:w="1113"/>
             </w:tblGrid>
             <w:tr>
               <w:trPr>
@@ -2066,7 +2066,29 @@
                       <w:sz w:val="20"/>
                       <w:szCs w:val="20"/>
                     </w:rPr>
-                    <w:t>Box Size In Inch</w:t>
+                    <w:t xml:space="preserve">Box Size </w:t>
+                  </w:r>
+                  <w:proofErr w:type="gramStart"/>
+                  <w:r>
+                    <w:rPr>
+                      <w:rFonts w:cstheme="minorHAnsi"/>
+                      <w:b/>
+                      <w:bCs/>
+                      <w:sz w:val="20"/>
+                      <w:szCs w:val="20"/>
+                    </w:rPr>
+                    <w:t>In</w:t>
+                  </w:r>
+                  <w:proofErr w:type="gramEnd"/>
+                  <w:r>
+                    <w:rPr>
+                      <w:rFonts w:cstheme="minorHAnsi"/>
+                      <w:b/>
+                      <w:bCs/>
+                      <w:sz w:val="20"/>
+                      <w:szCs w:val="20"/>
+                    </w:rPr>
+                    <w:t xml:space="preserve"> Inch</w:t>
                   </w:r>
                 </w:p>
               </w:tc>
@@ -2105,6 +2127,7 @@
                     </w:rPr>
                     <w:t>{#</w:t>
                   </w:r>
+                  <w:proofErr w:type="gramStart"/>
                   <w:r>
                     <w:rPr>
                       <w:rFonts w:cstheme="minorHAnsi"/>
@@ -2129,7 +2152,18 @@
                       <w:sz w:val="20"/>
                       <w:szCs w:val="20"/>
                     </w:rPr>
-                    <w:t>{thicknessDetail}</w:t>
+                    <w:t>{</w:t>
+                  </w:r>
+                  <w:proofErr w:type="gramEnd"/>
+                  <w:r>
+                    <w:rPr>
+                      <w:rFonts w:cstheme="minorHAnsi"/>
+                      <w:b/>
+                      <w:bCs/>
+                      <w:sz w:val="20"/>
+                      <w:szCs w:val="20"/>
+                    </w:rPr>
+                    <w:t>thicknessDetail}</w:t>
                   </w:r>
                 </w:p>
                 <w:p>
@@ -2340,7 +2374,25 @@
                       <w:sz w:val="20"/>
                       <w:szCs w:val="20"/>
                     </w:rPr>
-                    <w:t>} to {</w:t>
+                    <w:t>}{#containerTo} to {</w:t>
+                  </w:r>
+                  <w:proofErr w:type="spellStart"/>
+                  <w:r>
+                    <w:rPr>
+                      <w:rFonts w:cstheme="minorHAnsi"/>
+                      <w:sz w:val="20"/>
+                      <w:szCs w:val="20"/>
+                    </w:rPr>
+                    <w:t>containerTo</w:t>
+                  </w:r>
+                  <w:proofErr w:type="spellEnd"/>
+                  <w:r>
+                    <w:rPr>
+                      <w:rFonts w:cstheme="minorHAnsi"/>
+                      <w:sz w:val="20"/>
+                      <w:szCs w:val="20"/>
+                    </w:rPr>
+                    <w:t>}{/</w:t>
                   </w:r>
                   <w:proofErr w:type="spellStart"/>
                   <w:r>
@@ -2628,6 +2680,32 @@
                       <w:szCs w:val="20"/>
                     </w:rPr>
                   </w:pPr>
+                  <w:r>
+                    <w:rPr>
+                      <w:rFonts w:cstheme="minorHAnsi"/>
+                      <w:sz w:val="20"/>
+                      <w:szCs w:val="20"/>
+                    </w:rPr>
+                    <w:t>{</w:t>
+                  </w:r>
+                  <w:proofErr w:type="spellStart"/>
+                  <w:r>
+                    <w:rPr>
+                      <w:rFonts w:cstheme="minorHAnsi"/>
+                      <w:sz w:val="20"/>
+                      <w:szCs w:val="20"/>
+                    </w:rPr>
+                    <w:t>netWeight</w:t>
+                  </w:r>
+                  <w:proofErr w:type="spellEnd"/>
+                  <w:r>
+                    <w:rPr>
+                      <w:rFonts w:cstheme="minorHAnsi"/>
+                      <w:sz w:val="20"/>
+                      <w:szCs w:val="20"/>
+                    </w:rPr>
+                    <w:t>}</w:t>
+                  </w:r>
                 </w:p>
               </w:tc>
               <w:tc>
@@ -2649,6 +2727,32 @@
                       <w:szCs w:val="20"/>
                     </w:rPr>
                   </w:pPr>
+                  <w:r>
+                    <w:rPr>
+                      <w:rFonts w:cstheme="minorHAnsi"/>
+                      <w:sz w:val="20"/>
+                      <w:szCs w:val="20"/>
+                    </w:rPr>
+                    <w:t>{</w:t>
+                  </w:r>
+                  <w:proofErr w:type="spellStart"/>
+                  <w:r>
+                    <w:rPr>
+                      <w:rFonts w:cstheme="minorHAnsi"/>
+                      <w:sz w:val="20"/>
+                      <w:szCs w:val="20"/>
+                    </w:rPr>
+                    <w:t>grossWeight</w:t>
+                  </w:r>
+                  <w:proofErr w:type="spellEnd"/>
+                  <w:r>
+                    <w:rPr>
+                      <w:rFonts w:cstheme="minorHAnsi"/>
+                      <w:sz w:val="20"/>
+                      <w:szCs w:val="20"/>
+                    </w:rPr>
+                    <w:t>}</w:t>
+                  </w:r>
                 </w:p>
               </w:tc>
               <w:tc>
@@ -3037,6 +3141,38 @@
                       <w:sz w:val="20"/>
                       <w:szCs w:val="20"/>
                     </w:rPr>
+                    <w:t>{</w:t>
+                  </w:r>
+                  <w:proofErr w:type="spellStart"/>
+                  <w:r>
+                    <w:rPr>
+                      <w:rFonts w:cstheme="minorHAnsi"/>
+                      <w:b/>
+                      <w:bCs/>
+                      <w:sz w:val="20"/>
+                      <w:szCs w:val="20"/>
+                    </w:rPr>
+                    <w:t>totalNetWeight</w:t>
+                  </w:r>
+                  <w:proofErr w:type="spellEnd"/>
+                  <w:r>
+                    <w:rPr>
+                      <w:rFonts w:cstheme="minorHAnsi"/>
+                      <w:b/>
+                      <w:bCs/>
+                      <w:sz w:val="20"/>
+                      <w:szCs w:val="20"/>
+                    </w:rPr>
+                    <w:t xml:space="preserve">} </w:t>
+                  </w:r>
+                  <w:r>
+                    <w:rPr>
+                      <w:rFonts w:cstheme="minorHAnsi"/>
+                      <w:b/>
+                      <w:bCs/>
+                      <w:sz w:val="20"/>
+                      <w:szCs w:val="20"/>
+                    </w:rPr>
                     <w:t>Kg</w:t>
                   </w:r>
                   <w:r>
@@ -3104,6 +3240,38 @@
                       <w:szCs w:val="20"/>
                     </w:rPr>
                   </w:pPr>
+                  <w:r>
+                    <w:rPr>
+                      <w:rFonts w:cstheme="minorHAnsi"/>
+                      <w:b/>
+                      <w:bCs/>
+                      <w:sz w:val="20"/>
+                      <w:szCs w:val="20"/>
+                    </w:rPr>
+                    <w:t>{</w:t>
+                  </w:r>
+                  <w:proofErr w:type="spellStart"/>
+                  <w:r>
+                    <w:rPr>
+                      <w:rFonts w:cstheme="minorHAnsi"/>
+                      <w:b/>
+                      <w:bCs/>
+                      <w:sz w:val="20"/>
+                      <w:szCs w:val="20"/>
+                    </w:rPr>
+                    <w:t>totalGrossWeight</w:t>
+                  </w:r>
+                  <w:proofErr w:type="spellEnd"/>
+                  <w:r>
+                    <w:rPr>
+                      <w:rFonts w:cstheme="minorHAnsi"/>
+                      <w:b/>
+                      <w:bCs/>
+                      <w:sz w:val="20"/>
+                      <w:szCs w:val="20"/>
+                    </w:rPr>
+                    <w:t xml:space="preserve">} </w:t>
+                  </w:r>
                   <w:r>
                     <w:rPr>
                       <w:rFonts w:cstheme="minorHAnsi"/>

</xml_diff>